<commit_message>
Rewrite Demo and KeyDemo to use gpiozero; update guide
L298N_Demo.py: was a duplicate of KeyDemo (copy-paste accident).
Replaced with a proper timed ramp sequence demo using gpiozero.

L298N_KeyDemo.py: rewritten from RPi.GPIO to gpiozero. Speed
values now stored as 0.0-1.0 floats instead of integers.
Cleanup is automatic via gpiozero, no GPIO.cleanup() needed.

L298N_Motor_Control_Guide.docx: added note explaining why
gpiozero is used in preference to the older RPi.GPIO library.

Co-Authored-By: Claude Sonnet 4.6 <noreply@anthropic.com>
</commit_message>
<xml_diff>
--- a/LF7_Adafruit_Demo/L298N/L298N_Motor_Control_Guide.docx
+++ b/LF7_Adafruit_Demo/L298N/L298N_Motor_Control_Guide.docx
@@ -87,6 +87,31 @@
           <w:szCs w:val="22"/>
         </w:rPr>
         <w:t xml:space="preserve">There are three Python scripts for controlling a DC motor via an L298N driver board connected to a Raspberry Pi. Choose the one that fits your situation:</w:t>
+      </w:r>
+    </w:p>
+    <w:p>
+      <w:pPr>
+        <w:spacing w:after="0" w:before="60"/>
+      </w:pPr>
+    </w:p>
+    <w:p>
+      <w:pPr>
+        <w:pBdr>
+          <w:left w:val="single" w:color="1F5C99" w:sz="12" w:space="8"/>
+        </w:pBdr>
+        <w:spacing w:after="80" w:before="80"/>
+        <w:ind w:left="360"/>
+      </w:pPr>
+      <w:r>
+        <w:rPr>
+          <w:rFonts w:ascii="Arial" w:cs="Arial" w:eastAsia="Arial" w:hAnsi="Arial"/>
+          <w:i/>
+          <w:iCs/>
+          <w:color w:val="555555"/>
+          <w:sz w:val="20"/>
+          <w:szCs w:val="20"/>
+        </w:rPr>
+        <w:t xml:space="preserve">All scripts use gpiozero, the current recommended GPIO library for Raspberry Pi OS. gpiozero handles pin setup, PWM and cleanup automatically. The older RPi.GPIO library is no longer actively developed and requires manual pin configuration, PWM setup and GPIO.cleanup() calls — gpiozero takes care of all of this for you.</w:t>
       </w:r>
     </w:p>
     <w:p>

</xml_diff>